<commit_message>
Shorten data checklist; add blank fields for custom items
Co-Authored-By: Claude Sonnet 5.5 <noreply@anthropic.com>
Claude-Session: https://claude.ai/code/session_012cZcoDbiDEXFsCGN3U25qM
</commit_message>
<xml_diff>
--- a/Заявка_на_перенос_данных_1С.docx
+++ b/Заявка_на_перенос_данных_1С.docx
@@ -1063,18 +1063,18 @@
         </w:tblBorders>
       </w:tblPr>
       <w:tblGrid>
-        <w:gridCol w:w="3212"/>
-        <w:gridCol w:w="3213"/>
-        <w:gridCol w:w="3213"/>
+        <w:gridCol w:w="3900"/>
+        <w:gridCol w:w="2200"/>
+        <w:gridCol w:w="3538"/>
       </w:tblGrid>
       <w:tr>
         <w:trPr>
           <w:cantSplit/>
-          <w:trHeight w:val="330" w:hRule="atLeast"/>
+          <w:trHeight w:val="380" w:hRule="atLeast"/>
         </w:trPr>
         <w:tc>
           <w:tcPr>
-            <w:tcW w:type="dxa" w:w="3212"/>
+            <w:tcW w:type="dxa" w:w="3900"/>
             <w:tcBorders>
               <w:top w:val="single" w:color="A6A6A6" w:sz="4"/>
               <w:left w:val="single" w:color="A6A6A6" w:sz="4"/>
@@ -1116,13 +1116,13 @@
                 <w:sz w:val="18"/>
                 <w:szCs w:val="18"/>
               </w:rPr>
-              <w:t xml:space="preserve">  Клиенты (контрагенты)</w:t>
-            </w:r>
-          </w:p>
-        </w:tc>
-        <w:tc>
-          <w:tcPr>
-            <w:tcW w:type="dxa" w:w="3213"/>
+              <w:t xml:space="preserve">  Контрагенты и контактная информация</w:t>
+            </w:r>
+          </w:p>
+        </w:tc>
+        <w:tc>
+          <w:tcPr>
+            <w:tcW w:type="dxa" w:w="2200"/>
             <w:tcBorders>
               <w:top w:val="single" w:color="A6A6A6" w:sz="4"/>
               <w:left w:val="single" w:color="A6A6A6" w:sz="4"/>
@@ -1164,13 +1164,13 @@
                 <w:sz w:val="18"/>
                 <w:szCs w:val="18"/>
               </w:rPr>
-              <w:t xml:space="preserve">  Контактные лица, телефоны</w:t>
-            </w:r>
-          </w:p>
-        </w:tc>
-        <w:tc>
-          <w:tcPr>
-            <w:tcW w:type="dxa" w:w="3213"/>
+              <w:t xml:space="preserve">  Автомобили</w:t>
+            </w:r>
+          </w:p>
+        </w:tc>
+        <w:tc>
+          <w:tcPr>
+            <w:tcW w:type="dxa" w:w="3538"/>
             <w:tcBorders>
               <w:top w:val="single" w:color="A6A6A6" w:sz="4"/>
               <w:left w:val="single" w:color="A6A6A6" w:sz="4"/>
@@ -1212,7 +1212,7 @@
                 <w:sz w:val="18"/>
                 <w:szCs w:val="18"/>
               </w:rPr>
-              <w:t xml:space="preserve">  Автомобили (VIN, госномер)</w:t>
+              <w:t xml:space="preserve">  Заказ-наряды</w:t>
             </w:r>
           </w:p>
         </w:tc>
@@ -1220,11 +1220,11 @@
       <w:tr>
         <w:trPr>
           <w:cantSplit/>
-          <w:trHeight w:val="330" w:hRule="atLeast"/>
+          <w:trHeight w:val="380" w:hRule="atLeast"/>
         </w:trPr>
         <w:tc>
           <w:tcPr>
-            <w:tcW w:type="dxa" w:w="3212"/>
+            <w:tcW w:type="dxa" w:w="3900"/>
             <w:tcBorders>
               <w:top w:val="single" w:color="A6A6A6" w:sz="4"/>
               <w:left w:val="single" w:color="A6A6A6" w:sz="4"/>
@@ -1266,13 +1266,13 @@
                 <w:sz w:val="18"/>
                 <w:szCs w:val="18"/>
               </w:rPr>
-              <w:t xml:space="preserve">  Заказ-наряды</w:t>
-            </w:r>
-          </w:p>
-        </w:tc>
-        <w:tc>
-          <w:tcPr>
-            <w:tcW w:type="dxa" w:w="3213"/>
+              <w:t xml:space="preserve">  Сотрудники</w:t>
+            </w:r>
+          </w:p>
+        </w:tc>
+        <w:tc>
+          <w:tcPr>
+            <w:tcW w:type="dxa" w:w="2200"/>
             <w:tcBorders>
               <w:top w:val="single" w:color="A6A6A6" w:sz="4"/>
               <w:left w:val="single" w:color="A6A6A6" w:sz="4"/>
@@ -1314,13 +1314,13 @@
                 <w:sz w:val="18"/>
                 <w:szCs w:val="18"/>
               </w:rPr>
-              <w:t xml:space="preserve">  Записи на обслуживание</w:t>
-            </w:r>
-          </w:p>
-        </w:tc>
-        <w:tc>
-          <w:tcPr>
-            <w:tcW w:type="dxa" w:w="3213"/>
+              <w:t xml:space="preserve">  Автоработы</w:t>
+            </w:r>
+          </w:p>
+        </w:tc>
+        <w:tc>
+          <w:tcPr>
+            <w:tcW w:type="dxa" w:w="3538"/>
             <w:tcBorders>
               <w:top w:val="single" w:color="A6A6A6" w:sz="4"/>
               <w:left w:val="single" w:color="A6A6A6" w:sz="4"/>
@@ -1362,7 +1362,7 @@
                 <w:sz w:val="18"/>
                 <w:szCs w:val="18"/>
               </w:rPr>
-              <w:t xml:space="preserve">  Сотрудники, мастера</w:t>
+              <w:t xml:space="preserve">  Номенклатура и остатки по складам</w:t>
             </w:r>
           </w:p>
         </w:tc>
@@ -1370,11 +1370,11 @@
       <w:tr>
         <w:trPr>
           <w:cantSplit/>
-          <w:trHeight w:val="330" w:hRule="atLeast"/>
+          <w:trHeight w:val="380" w:hRule="atLeast"/>
         </w:trPr>
         <w:tc>
           <w:tcPr>
-            <w:tcW w:type="dxa" w:w="3212"/>
+            <w:tcW w:type="dxa" w:w="3900"/>
             <w:tcBorders>
               <w:top w:val="single" w:color="A6A6A6" w:sz="4"/>
               <w:left w:val="single" w:color="A6A6A6" w:sz="4"/>
@@ -1416,13 +1416,13 @@
                 <w:sz w:val="18"/>
                 <w:szCs w:val="18"/>
               </w:rPr>
-              <w:t xml:space="preserve">  Услуги и запчасти</w:t>
-            </w:r>
-          </w:p>
-        </w:tc>
-        <w:tc>
-          <w:tcPr>
-            <w:tcW w:type="dxa" w:w="3213"/>
+              <w:t xml:space="preserve">  Другое: ______________________</w:t>
+            </w:r>
+          </w:p>
+        </w:tc>
+        <w:tc>
+          <w:tcPr>
+            <w:tcW w:type="dxa" w:w="2200"/>
             <w:tcBorders>
               <w:top w:val="single" w:color="A6A6A6" w:sz="4"/>
               <w:left w:val="single" w:color="A6A6A6" w:sz="4"/>
@@ -1464,13 +1464,13 @@
                 <w:sz w:val="18"/>
                 <w:szCs w:val="18"/>
               </w:rPr>
-              <w:t xml:space="preserve">  Остатки на складе</w:t>
-            </w:r>
-          </w:p>
-        </w:tc>
-        <w:tc>
-          <w:tcPr>
-            <w:tcW w:type="dxa" w:w="3213"/>
+              <w:t xml:space="preserve">  Другое: _________</w:t>
+            </w:r>
+          </w:p>
+        </w:tc>
+        <w:tc>
+          <w:tcPr>
+            <w:tcW w:type="dxa" w:w="3538"/>
             <w:tcBorders>
               <w:top w:val="single" w:color="A6A6A6" w:sz="4"/>
               <w:left w:val="single" w:color="A6A6A6" w:sz="4"/>
@@ -1512,62 +1512,7 @@
                 <w:sz w:val="18"/>
                 <w:szCs w:val="18"/>
               </w:rPr>
-              <w:t xml:space="preserve">  Справочники и настройки</w:t>
-            </w:r>
-          </w:p>
-        </w:tc>
-      </w:tr>
-      <w:tr>
-        <w:trPr>
-          <w:cantSplit/>
-          <w:trHeight w:val="330" w:hRule="atLeast"/>
-        </w:trPr>
-        <w:tc>
-          <w:tcPr>
-            <w:tcW w:type="dxa" w:w="9638"/>
-            <w:gridSpan w:val="3"/>
-            <w:tcBorders>
-              <w:top w:val="single" w:color="A6A6A6" w:sz="4"/>
-              <w:left w:val="single" w:color="A6A6A6" w:sz="4"/>
-              <w:bottom w:val="single" w:color="A6A6A6" w:sz="4"/>
-              <w:right w:val="single" w:color="A6A6A6" w:sz="4"/>
-            </w:tcBorders>
-            <w:tcMar>
-              <w:top w:type="dxa" w:w="40"/>
-              <w:left w:type="dxa" w:w="100"/>
-              <w:bottom w:type="dxa" w:w="40"/>
-              <w:right w:type="dxa" w:w="100"/>
-            </w:tcMar>
-            <w:vAlign w:val="center"/>
-          </w:tcPr>
-          <w:p>
-            <w:pPr>
-              <w:spacing w:after="0"/>
-            </w:pPr>
-            <w:sdt>
-              <w:sdtPr>
-                <w14:checkbox>
-                  <w14:checked w14:val="0"/>
-                  <w14:checkedState w14:val="2612" w14:font="MS Gothic"/>
-                  <w14:uncheckedState w14:val="2610" w14:font="MS Gothic"/>
-                </w14:checkbox>
-              </w:sdtPr>
-              <w:sdtContent>
-                <w:r>
-                  <w:rPr>
-                    <w:rFonts w:ascii="MS Gothic" w:eastAsia="MS Gothic" w:hAnsi="MS Gothic" w:hint="eastAsia"/>
-                  </w:rPr>
-                  <w:t>☐</w:t>
-                </w:r>
-              </w:sdtContent>
-            </w:sdt>
-            <w:r>
-              <w:rPr>
-                <w:rFonts w:ascii="Arial" w:cs="Arial" w:eastAsia="Arial" w:hAnsi="Arial"/>
-                <w:sz w:val="18"/>
-                <w:szCs w:val="18"/>
-              </w:rPr>
-              <w:t xml:space="preserve">  Другое: ____________________________________________________________________</w:t>
+              <w:t xml:space="preserve">  Другое: ___________________</w:t>
             </w:r>
           </w:p>
         </w:tc>

</xml_diff>

<commit_message>
Define Client and Contractor at the top; drop '(мы)'
Co-Authored-By: Claude Sonnet 5.5 <noreply@anthropic.com>
Claude-Session: https://claude.ai/code/session_012cZcoDbiDEXFsCGN3U25qM
</commit_message>
<xml_diff>
--- a/Заявка_на_перенос_данных_1С.docx
+++ b/Заявка_на_перенос_данных_1С.docx
@@ -58,8 +58,54 @@
     </w:p>
     <w:p>
       <w:pPr>
+        <w:spacing w:after="20"/>
+      </w:pPr>
+      <w:r>
+        <w:rPr>
+          <w:rFonts w:ascii="Arial" w:cs="Arial" w:eastAsia="Arial" w:hAnsi="Arial"/>
+          <w:b/>
+          <w:bCs/>
+          <w:sz w:val="18"/>
+          <w:szCs w:val="18"/>
+        </w:rPr>
+        <w:t xml:space="preserve">Клиент</w:t>
+      </w:r>
+      <w:r>
+        <w:rPr>
+          <w:rFonts w:ascii="Arial" w:cs="Arial" w:eastAsia="Arial" w:hAnsi="Arial"/>
+          <w:sz w:val="18"/>
+          <w:szCs w:val="18"/>
+        </w:rPr>
+        <w:t xml:space="preserve"> — организация, чья база будет переноситься.</w:t>
+      </w:r>
+    </w:p>
+    <w:p>
+      <w:pPr>
+        <w:spacing w:after="20"/>
+      </w:pPr>
+      <w:r>
+        <w:rPr>
+          <w:rFonts w:ascii="Arial" w:cs="Arial" w:eastAsia="Arial" w:hAnsi="Arial"/>
+          <w:b/>
+          <w:bCs/>
+          <w:sz w:val="18"/>
+          <w:szCs w:val="18"/>
+        </w:rPr>
+        <w:t xml:space="preserve">Исполнитель</w:t>
+      </w:r>
+      <w:r>
+        <w:rPr>
+          <w:rFonts w:ascii="Arial" w:cs="Arial" w:eastAsia="Arial" w:hAnsi="Arial"/>
+          <w:sz w:val="18"/>
+          <w:szCs w:val="18"/>
+        </w:rPr>
+        <w:t xml:space="preserve"> — организация, которая будет выполнять перенос.</w:t>
+      </w:r>
+    </w:p>
+    <w:p>
+      <w:pPr>
         <w:keepNext/>
-        <w:spacing w:after="80" w:before="200"/>
+        <w:spacing w:after="60" w:before="140"/>
       </w:pPr>
       <w:r>
         <w:rPr>
@@ -195,7 +241,7 @@
                 <w:sz w:val="17"/>
                 <w:szCs w:val="17"/>
               </w:rPr>
-              <w:t xml:space="preserve">ИСПОЛНИТЕЛЬ (мы)</w:t>
+              <w:t xml:space="preserve">ИСПОЛНИТЕЛЬ</w:t>
             </w:r>
           </w:p>
         </w:tc>
@@ -613,7 +659,7 @@
     <w:p>
       <w:pPr>
         <w:keepNext/>
-        <w:spacing w:after="80" w:before="200"/>
+        <w:spacing w:after="60" w:before="140"/>
       </w:pPr>
       <w:r>
         <w:rPr>
@@ -1521,7 +1567,7 @@
     <w:p>
       <w:pPr>
         <w:keepNext/>
-        <w:spacing w:after="80" w:before="200"/>
+        <w:spacing w:after="60" w:before="140"/>
       </w:pPr>
       <w:r>
         <w:rPr>
@@ -1610,7 +1656,7 @@
     <w:p>
       <w:pPr>
         <w:keepNext/>
-        <w:spacing w:after="80" w:before="200"/>
+        <w:spacing w:after="60" w:before="140"/>
       </w:pPr>
       <w:r>
         <w:rPr>
@@ -1752,7 +1798,7 @@
       <w:tr>
         <w:trPr>
           <w:cantSplit/>
-          <w:trHeight w:val="460" w:hRule="atLeast"/>
+          <w:trHeight w:val="400" w:hRule="atLeast"/>
         </w:trPr>
         <w:tc>
           <w:tcPr>
@@ -1957,7 +2003,7 @@
       <w:tr>
         <w:trPr>
           <w:cantSplit/>
-          <w:trHeight w:val="560" w:hRule="atLeast"/>
+          <w:trHeight w:val="500" w:hRule="atLeast"/>
         </w:trPr>
         <w:tc>
           <w:tcPr>
@@ -2286,7 +2332,7 @@
       <w:tr>
         <w:trPr>
           <w:cantSplit/>
-          <w:trHeight w:val="950" w:hRule="atLeast"/>
+          <w:trHeight w:val="880" w:hRule="atLeast"/>
         </w:trPr>
         <w:tc>
           <w:tcPr>

</xml_diff>

<commit_message>
Trim terms: drop backup/downtime bullets, delete temp copies after work is done
Co-Authored-By: Claude Sonnet 5.5 <noreply@anthropic.com>
Claude-Session: https://claude.ai/code/session_012cZcoDbiDEXFsCGN3U25qM
</commit_message>
<xml_diff>
--- a/Заявка_на_перенос_данных_1С.docx
+++ b/Заявка_на_перенос_данных_1С.docx
@@ -1614,43 +1614,7 @@
           <w:sz w:val="18"/>
           <w:szCs w:val="18"/>
         </w:rPr>
-        <w:t xml:space="preserve">Перед переносом Исполнитель делает копию исходной базы, после переноса сверяет количество перенесённых записей. Клиенту рекомендуется иметь и свою копию. Лицензии на 1С — у Клиента.</w:t>
-      </w:r>
-    </w:p>
-    <w:p>
-      <w:pPr>
-        <w:pStyle w:val="ListParagraph"/>
-        <w:numPr>
-          <w:ilvl w:val="0"/>
-          <w:numId w:val="2"/>
-        </w:numPr>
-        <w:spacing w:after="40"/>
-      </w:pPr>
-      <w:r>
-        <w:rPr>
-          <w:rFonts w:ascii="Arial" w:cs="Arial" w:eastAsia="Arial" w:hAnsi="Arial"/>
-          <w:sz w:val="18"/>
-          <w:szCs w:val="18"/>
-        </w:rPr>
-        <w:t xml:space="preserve">На время переноса пользователям нужно выйти из базы.</w:t>
-      </w:r>
-    </w:p>
-    <w:p>
-      <w:pPr>
-        <w:pStyle w:val="ListParagraph"/>
-        <w:numPr>
-          <w:ilvl w:val="0"/>
-          <w:numId w:val="2"/>
-        </w:numPr>
-        <w:spacing w:after="40"/>
-      </w:pPr>
-      <w:r>
-        <w:rPr>
-          <w:rFonts w:ascii="Arial" w:cs="Arial" w:eastAsia="Arial" w:hAnsi="Arial"/>
-          <w:sz w:val="18"/>
-          <w:szCs w:val="18"/>
-        </w:rPr>
-        <w:t xml:space="preserve">Данные содержат персональные данные клиентов Клиента. Клиент поручает Исполнителю обработку этих данных (копирование, перенос, проверка) только для целей переноса. Исполнитель не передаёт их третьим лицам (152-ФЗ) и удаляет временные копии в течение ____ дней после завершения работ.</w:t>
+        <w:t xml:space="preserve">Данные содержат персональные данные клиентов Клиента. Клиент поручает Исполнителю обработку этих данных (копирование, перенос, проверка) только для целей переноса. Исполнитель не передаёт их третьим лицам (152-ФЗ) и удаляет временные копии после выполнения работ.</w:t>
       </w:r>
     </w:p>
     <w:p>

</xml_diff>

<commit_message>
Compact layout so the request fits on one page in Word
Co-Authored-By: Claude Sonnet 5.5 <noreply@anthropic.com>
Claude-Session: https://claude.ai/code/session_012cZcoDbiDEXFsCGN3U25qM
</commit_message>
<xml_diff>
--- a/Заявка_на_перенос_данных_1С.docx
+++ b/Заявка_на_перенос_данных_1С.docx
@@ -249,7 +249,7 @@
       <w:tr>
         <w:trPr>
           <w:cantSplit/>
-          <w:trHeight w:val="340" w:hRule="atLeast"/>
+          <w:trHeight w:val="320" w:hRule="atLeast"/>
         </w:trPr>
         <w:tc>
           <w:tcPr>
@@ -358,7 +358,7 @@
       <w:tr>
         <w:trPr>
           <w:cantSplit/>
-          <w:trHeight w:val="340" w:hRule="atLeast"/>
+          <w:trHeight w:val="320" w:hRule="atLeast"/>
         </w:trPr>
         <w:tc>
           <w:tcPr>
@@ -458,7 +458,7 @@
       <w:tr>
         <w:trPr>
           <w:cantSplit/>
-          <w:trHeight w:val="340" w:hRule="atLeast"/>
+          <w:trHeight w:val="320" w:hRule="atLeast"/>
         </w:trPr>
         <w:tc>
           <w:tcPr>
@@ -558,7 +558,7 @@
       <w:tr>
         <w:trPr>
           <w:cantSplit/>
-          <w:trHeight w:val="340" w:hRule="atLeast"/>
+          <w:trHeight w:val="320" w:hRule="atLeast"/>
         </w:trPr>
         <w:tc>
           <w:tcPr>
@@ -692,7 +692,7 @@
       <w:tr>
         <w:trPr>
           <w:cantSplit/>
-          <w:trHeight w:val="340" w:hRule="atLeast"/>
+          <w:trHeight w:val="320" w:hRule="atLeast"/>
         </w:trPr>
         <w:tc>
           <w:tcPr>
@@ -770,7 +770,7 @@
       <w:tr>
         <w:trPr>
           <w:cantSplit/>
-          <w:trHeight w:val="340" w:hRule="atLeast"/>
+          <w:trHeight w:val="320" w:hRule="atLeast"/>
         </w:trPr>
         <w:tc>
           <w:tcPr>
@@ -848,7 +848,7 @@
       <w:tr>
         <w:trPr>
           <w:cantSplit/>
-          <w:trHeight w:val="340" w:hRule="atLeast"/>
+          <w:trHeight w:val="320" w:hRule="atLeast"/>
         </w:trPr>
         <w:tc>
           <w:tcPr>
@@ -926,7 +926,7 @@
       <w:tr>
         <w:trPr>
           <w:cantSplit/>
-          <w:trHeight w:val="340" w:hRule="atLeast"/>
+          <w:trHeight w:val="320" w:hRule="atLeast"/>
         </w:trPr>
         <w:tc>
           <w:tcPr>
@@ -1004,7 +1004,7 @@
       <w:tr>
         <w:trPr>
           <w:cantSplit/>
-          <w:trHeight w:val="340" w:hRule="atLeast"/>
+          <w:trHeight w:val="320" w:hRule="atLeast"/>
         </w:trPr>
         <w:tc>
           <w:tcPr>
@@ -1116,7 +1116,7 @@
       <w:tr>
         <w:trPr>
           <w:cantSplit/>
-          <w:trHeight w:val="380" w:hRule="atLeast"/>
+          <w:trHeight w:val="340" w:hRule="atLeast"/>
         </w:trPr>
         <w:tc>
           <w:tcPr>
@@ -1266,7 +1266,7 @@
       <w:tr>
         <w:trPr>
           <w:cantSplit/>
-          <w:trHeight w:val="380" w:hRule="atLeast"/>
+          <w:trHeight w:val="340" w:hRule="atLeast"/>
         </w:trPr>
         <w:tc>
           <w:tcPr>
@@ -1416,7 +1416,7 @@
       <w:tr>
         <w:trPr>
           <w:cantSplit/>
-          <w:trHeight w:val="380" w:hRule="atLeast"/>
+          <w:trHeight w:val="340" w:hRule="atLeast"/>
         </w:trPr>
         <w:tc>
           <w:tcPr>
@@ -1620,19 +1620,8 @@
     <w:p>
       <w:pPr>
         <w:keepNext/>
-        <w:spacing w:after="60" w:before="140"/>
+        <w:spacing w:after="0" w:before="120"/>
       </w:pPr>
-      <w:r>
-        <w:rPr>
-          <w:rFonts w:ascii="Arial" w:cs="Arial" w:eastAsia="Arial" w:hAnsi="Arial"/>
-          <w:b/>
-          <w:bCs/>
-          <w:color w:val="1F3864"/>
-          <w:sz w:val="21"/>
-          <w:szCs w:val="21"/>
-        </w:rPr>
-        <w:t xml:space="preserve">4. Подписи</w:t>
-      </w:r>
     </w:p>
     <w:tbl>
       <w:tblPr>
@@ -2296,7 +2285,7 @@
       <w:tr>
         <w:trPr>
           <w:cantSplit/>
-          <w:trHeight w:val="880" w:hRule="atLeast"/>
+          <w:trHeight w:val="800" w:hRule="atLeast"/>
         </w:trPr>
         <w:tc>
           <w:tcPr>
@@ -2573,7 +2562,7 @@
       <w:headerReference w:type="default" r:id="rId7"/>
       <w:footerReference w:type="default" r:id="rId8"/>
       <w:pgSz w:w="11906" w:h="16838" w:orient="portrait"/>
-      <w:pgMar w:top="1050" w:right="1134" w:bottom="900" w:left="1134" w:header="500" w:footer="400" w:gutter="0"/>
+      <w:pgMar w:top="900" w:right="1134" w:bottom="800" w:left="1134" w:header="340" w:footer="340" w:gutter="0"/>
       <w:pgNumType/>
       <w:docGrid w:linePitch="360"/>
     </w:sectPr>
@@ -2740,7 +2729,7 @@
         </w:tcPr>
         <w:p>
           <w:pPr>
-            <w:spacing w:after="400" w:before="400"/>
+            <w:spacing w:after="250" w:before="250"/>
             <w:jc w:val="center"/>
           </w:pPr>
           <w:r>
@@ -2837,7 +2826,7 @@
       <w:pBdr>
         <w:bottom w:val="single" w:color="1F3864" w:sz="18" w:space="1"/>
       </w:pBdr>
-      <w:spacing w:after="0" w:before="120"/>
+      <w:spacing w:after="0" w:before="60"/>
     </w:pPr>
   </w:p>
 </w:hdr>

</xml_diff>